<commit_message>
SACC meta-analysis: full-text extraction, overlap resolution, pooled analysis, rebuilt manuscript
- Retrieved full texts (PMC/Europe PMC + LWW supplements) for 17 reports and
  extracted data into data/analysis_ready/*.csv with source locations
- Resolved overlap groups G2, G3, G5; Pan 2023 reassigned to separate cohort G9
- Ran interim PubMed search (337 records); added Feng 2015, Wu 2021, Chai 2026
- Ran R/run_all.R (21 pooled outcomes); committed output tables
- Rebuilt manuscript with data-driven Results, Tables 1-6, S2, S4, S5
- Completed references from PubMed; tests use header-only copies

Co-Authored-By: Claude Opus 5.5 <noreply@anthropic.com>
Claude-Session: https://claude.ai/code/session_01XrDQ7K98S3Gz9dRtKKNUgh
</commit_message>
<xml_diff>
--- a/sacc-meta-analysis/manuscript/Figure_and_Table_Legends.docx
+++ b/sacc-meta-analysis/manuscript/Figure_and_Table_Legends.docx
@@ -41,7 +41,7 @@
           <w:i w:val="0"/>
           <w:sz w:val="24"/>
         </w:rPr>
-        <w:t xml:space="preserve"> PRISMA 2020 flow diagram of study selection. Record counts are entered from verified screening logs.</w:t>
+        <w:t xml:space="preserve"> PRISMA 2020 flow diagram of study selection (interim: PubMed only; the remaining databases are still to be searched). Counts are read from data/analysis_ready/prisma_counts.csv.</w:t>
       </w:r>
     </w:p>
     <w:p>
@@ -61,7 +61,7 @@
           <w:i w:val="0"/>
           <w:sz w:val="24"/>
         </w:rPr>
-        <w:t xml:space="preserve"> Characteristics of identified studies Values are from bibliographic records and published abstracts identified on 2026-10-05 and must be confirmed against full texts before submission. NR, not retrieved; *, species presumed from an </w:t>
+        <w:t xml:space="preserve"> Characteristics of identified studies Extracted from full texts on 5 October 2026 except where marked 'no full text'. NR, not reported; mo, months; </w:t>
       </w:r>
       <w:r>
         <w:rPr>
@@ -79,7 +79,7 @@
           <w:i w:val="0"/>
           <w:sz w:val="24"/>
         </w:rPr>
-        <w:t>-endemic setting, to be confirmed; overlap groups G1-G8 are defined in Supplementary Table S6.</w:t>
+        <w:t xml:space="preserve"> presumed = endemic-area cohort, species not confirmed. Overlap groups are defined in Supplementary Table S6. Six further comparative reports identified by the PubMed search could not be retrieved (Supplementary Table S2).</w:t>
       </w:r>
     </w:p>
     <w:p>
@@ -119,7 +119,7 @@
           <w:i w:val="0"/>
           <w:sz w:val="24"/>
         </w:rPr>
-        <w:t xml:space="preserve"> Clinicopathological outcomes available by study (screening stage) A, outcome mentioned in the abstract; ?, availability to be determined from the full text. This table will be replaced by extracted SACC and NSACC counts (Supplementary Table S3) after full-text extraction.</w:t>
+        <w:t xml:space="preserve"> Clinicopathological outcomes by study: events/total in SACC vs NSACC Only the report used for each outcome within an overlap group is shown (Supplementary Table S6). -, not reported or taken from another report of the same cohort. LN+, lymph-node metastasis; M1, distant metastasis (stage IV where M stage was not given separately); PNI, perineural invasion. Definitions differ between studies (see notes in the extraction file).</w:t>
       </w:r>
     </w:p>
     <w:p>
@@ -159,7 +159,25 @@
           <w:i w:val="0"/>
           <w:sz w:val="24"/>
         </w:rPr>
-        <w:t xml:space="preserve"> Molecular evidence map for SACC versus NSACC Screening-stage map; sample sizes and directions are to be verified from full texts. Pooled effects are computed only for biomarkers with at least two comparable internal-comparator studies.</w:t>
+        <w:t xml:space="preserve"> Molecular evidence map for SACC versus NSACC All Qingpu reports (Wang 2021, Wang 2023, Pan 2020, Cheng 2023, Chai 2026) describe one cohort; each biomarker appears once. Biomarkers were pooled only with at least two independent internal-comparator cohorts. Abstract-only data on </w:t>
+      </w:r>
+      <w:r>
+        <w:rPr>
+          <w:rFonts w:ascii="Arial" w:hAnsi="Arial" w:eastAsia="Arial"/>
+          <w:b w:val="0"/>
+          <w:i/>
+          <w:sz w:val="24"/>
+        </w:rPr>
+        <w:t>S. mansoni</w:t>
+      </w:r>
+      <w:r>
+        <w:rPr>
+          <w:rFonts w:ascii="Arial" w:hAnsi="Arial" w:eastAsia="Arial"/>
+          <w:b w:val="0"/>
+          <w:i w:val="0"/>
+          <w:sz w:val="24"/>
+        </w:rPr>
+        <w:t xml:space="preserve"> (Madbouly 2007: p53 32/40 vs 8/20; MSI 3/40 vs 1/20) are not shown in the analysis.</w:t>
       </w:r>
     </w:p>
     <w:p>
@@ -239,7 +257,7 @@
           <w:i w:val="0"/>
           <w:sz w:val="24"/>
         </w:rPr>
-        <w:t xml:space="preserve"> Within-SACC prognostic factors SACC-only analyses; not combined with the SACC-versus-NSACC comparison. 'Reported finding' paraphrases the published abstract and must be checked against the full text; HRs are to be extracted.</w:t>
+        <w:t xml:space="preserve"> Within-SACC prognostic factors SACC-only analyses; not combined with the SACC-versus-NSACC comparison. Wang 2021 and Wang 2023 report P = 0.045 for HRs whose 95% CI includes 1. Factors from the Qingpu cohort (Wang 2021, Wang 2023, Pan 2020, Cheng 2023) describe the same patients.</w:t>
       </w:r>
     </w:p>
     <w:p>
@@ -259,7 +277,25 @@
           <w:i w:val="0"/>
           <w:sz w:val="24"/>
         </w:rPr>
-        <w:t xml:space="preserve"> Summary of meta-analyses: SACC versus NSACC Random-effects models with REML estimation. HR &gt; 1 and OR &gt; 1 indicate higher hazard or higher odds in SACC. Rows are filled automatically from output/tables/Table4_meta_analysis_summary.csv; outcomes with fewer than two independent cohorts are reported narratively.</w:t>
+        <w:t xml:space="preserve"> Summary of meta-analyses: SACC versus NSACC Random-effects models with REML estimation; </w:t>
+      </w:r>
+      <w:r>
+        <w:rPr>
+          <w:rFonts w:ascii="Arial" w:hAnsi="Arial" w:eastAsia="Arial"/>
+          <w:b w:val="0"/>
+          <w:i/>
+          <w:sz w:val="24"/>
+        </w:rPr>
+        <w:t>S. japonicum</w:t>
+      </w:r>
+      <w:r>
+        <w:rPr>
+          <w:rFonts w:ascii="Arial" w:hAnsi="Arial" w:eastAsia="Arial"/>
+          <w:b w:val="0"/>
+          <w:i w:val="0"/>
+          <w:sz w:val="24"/>
+        </w:rPr>
+        <w:t xml:space="preserve"> (presumed) cohorts; one report per overlap group per outcome. HR &gt; 1 and OR &gt; 1 indicate higher hazard or higher odds in SACC; MD &gt; 0, older SACC patients. Generated from output/tables/Table4_meta_analysis_summary.csv. GRADE ratings require two reviewers and are pending.</w:t>
       </w:r>
     </w:p>
     <w:p>
@@ -299,7 +335,7 @@
           <w:i w:val="0"/>
           <w:sz w:val="24"/>
         </w:rPr>
-        <w:t xml:space="preserve"> Phenotype matrix: is SACC distinct? Strong: &gt;= 3 independent cohorts, consistent direction, low-moderate risk of bias, moderate/high GRADE. Moderate: &gt;= 2 cohorts, consistent direction, low GRADE. Limited: single cohort or imprecise pooled estimate. Inconsistent: cohorts disagree in direction.</w:t>
+        <w:t xml:space="preserve"> Phenotype matrix: is SACC distinct? (provisional) Classified automatically from Table 4 before GRADE: Moderate, &gt;= 3 cohorts, 95% CI excluding no difference, I² &lt; 50%; Limited, fewer cohorts or imprecise; Inconsistent, I² &gt;= 75%. 'Strong' is reserved for findings with moderate/high GRADE certainty and is not yet assigned.</w:t>
       </w:r>
     </w:p>
     <w:p>
@@ -365,7 +401,7 @@
           <w:sz w:val="24"/>
           <w:vertAlign w:val="superscript"/>
         </w:rPr>
-        <w:t>3,5,18,34-37,41,44-47</w:t>
+        <w:t>3,5,18,35-38,42,43,52-54</w:t>
       </w:r>
     </w:p>
     <w:sectPr>

</xml_diff>